<commit_message>
clean repo and jsd investigation of measurement models
</commit_message>
<xml_diff>
--- a/reports/paper_v1_poetics/manuscript_v2.docx
+++ b/reports/paper_v1_poetics/manuscript_v2.docx
@@ -10,7 +10,7 @@
         <w:t>“</w:t>
       </w:r>
       <w:r>
-        <w:t>X</w:t>
+        <w:t>Power to the People</w:t>
       </w:r>
       <w:r>
         <w:t>”</w:t>
@@ -25,7 +25,19 @@
         <w:t xml:space="preserve">Bottom-Up </w:t>
       </w:r>
       <w:r>
-        <w:t>Using a Genre Tree Approach</w:t>
+        <w:t xml:space="preserve">Using a </w:t>
+      </w:r>
+      <w:r>
+        <w:t xml:space="preserve">Hierarchical </w:t>
+      </w:r>
+      <w:r>
+        <w:t>Genre</w:t>
+      </w:r>
+      <w:r>
+        <w:t>s</w:t>
+      </w:r>
+      <w:r>
+        <w:t xml:space="preserve"> Approach</w:t>
       </w:r>
     </w:p>
     <w:p>

</xml_diff>